<commit_message>
Sync submission materials for v0.1.6
</commit_message>
<xml_diff>
--- a/manuscript/bioinformatics_application_note_submission_20260619/Bioinformatics_Application_Note_cfRNA_BrainTrace_submission_ready_final.docx
+++ b/manuscript/bioinformatics_application_note_submission_20260619/Bioinformatics_Application_Note_cfRNA_BrainTrace_submission_ready_final.docx
@@ -86,44 +86,32 @@
     </w:p>
     <w:p>
       <w:r>
-        <w:t xml:space="preserve">Implemented in Python 3.11+ with command-line and Streamlit interfaces. Source code, README documentation, installation instructions, command-line and Streamlit entry points, unit tests, lightweight model artifacts, supplementary tables, validation/benchmark scripts and synthetic public example input/output files are available at </w:t>
+        <w:t>Implemented in Python 3.11+ with command-line and Streamlit interfaces. Source code, README documentation, installation instructions, command-line and Streamlit entry points, unit tests, lightweight model artifacts, supplementary tables, validation/benchmark scripts and synthetic public example input/output files are available at https://github.com/wz7717/cfrna-brain-tracing. The manuscript-associated software release is v0.1.6 and is archived at https://doi.org/10.5281/zenodo.20773674. A live Streamlit demonstration is available at https://brain-cfrna-tracing.streamlit.app/. The software is released under the MIT License.</w:t>
       </w:r>
       <w:r>
         <w:rPr>
           <w:b/>
         </w:rPr>
-        <w:t>https://github.com/wz7717/cfrna-brain-tracing</w:t>
       </w:r>
-      <w:r>
-        <w:t xml:space="preserve">. The manuscript release is archived at </w:t>
-      </w:r>
+      <w:r/>
       <w:r>
         <w:rPr>
           <w:b/>
         </w:rPr>
-        <w:t>https://doi.org/10.5281/zenodo.20773674</w:t>
       </w:r>
-      <w:r>
-        <w:t xml:space="preserve">. A live Streamlit demonstration is available at </w:t>
-      </w:r>
+      <w:r/>
       <w:r>
         <w:rPr>
           <w:b/>
         </w:rPr>
-        <w:t>https://brain-cfrna-tracing.streamlit.app/</w:t>
       </w:r>
-      <w:r>
-        <w:t xml:space="preserve">. The software is released under the </w:t>
-      </w:r>
+      <w:r/>
       <w:r>
         <w:rPr>
           <w:b/>
         </w:rPr>
-        <w:t>MIT License</w:t>
       </w:r>
-      <w:r>
-        <w:t>.</w:t>
-      </w:r>
+      <w:r/>
     </w:p>
     <w:p>
       <w:pPr>
@@ -431,17 +419,14 @@
     </w:p>
     <w:p>
       <w:r>
-        <w:t xml:space="preserve">The Bo2023 macaque transcriptomic atlas, Allen Human Brain Atlas, TCGA/BraTS and GEO datasets are available from their original repositories under their original access conditions. Repository scripts, processed non-sensitive evaluation tables and figure source data are archived with the release at </w:t>
+        <w:t>The Bo2023 macaque transcriptomic atlas, Allen Human Brain Atlas, TCGA/BraTS and GEO datasets are available from their original repositories under their original access conditions. Repository scripts, processed non-sensitive evaluation tables and figure source data are archived with the manuscript-associated v0.1.6 release at https://doi.org/10.5281/zenodo.20773674.</w:t>
       </w:r>
       <w:r>
         <w:rPr>
           <w:b/>
         </w:rPr>
-        <w:t>https://doi.org/10.5281/zenodo.20773674</w:t>
       </w:r>
-      <w:r>
-        <w:t>.</w:t>
-      </w:r>
+      <w:r/>
     </w:p>
     <w:p>
       <w:pPr>

</xml_diff>

<commit_message>
Correct validation denominators and audit workflow
</commit_message>
<xml_diff>
--- a/manuscript/bioinformatics_application_note_submission_20260619/Bioinformatics_Application_Note_cfRNA_BrainTrace_submission_ready_final.docx
+++ b/manuscript/bioinformatics_application_note_submission_20260619/Bioinformatics_Application_Note_cfRNA_BrainTrace_submission_ready_final.docx
@@ -73,7 +73,7 @@
     </w:p>
     <w:p>
       <w:r>
-        <w:t>cfRNA-BrainTrace is a Python and Streamlit application for hierarchical brain-origin candidate ranking from RNA expression profiles using a primate transcriptomic atlas. The locked production route uses projected variance-stabilized expression to generate a 10-class macaque Network Top3 beam, followed by logCPM-compatible reranking for resolution-group and exploratory exact-region candidates, while reporting marker coverage, entropy, score margins and scope warnings. In internal validation, Network Top3 accuracy reached 92.38% in leave-one-sample-out and 91.21% in leave-one-monkey-out evaluation, with lower accuracy at finer anatomical levels. External mapped-label and tumour/biofluid analyses define transfer limitations; cfRNA-BrainTrace is intended for reproducible coarse candidate ranking and resolution-limit auditing, not stand-alone clinical localization from unlabeled biofluid RNA.</w:t>
+        <w:t>cfRNA-BrainTrace is a Python and Streamlit application for hierarchical brain-origin candidate ranking from RNA expression profiles using a primate transcriptomic atlas. The locked production route uses projected variance-stabilized expression to generate a 10-class macaque Network Top3 beam, followed by logCPM-compatible reranking for resolution-group and exploratory exact-region candidates, while reporting marker coverage, entropy, score margins and scope warnings. In internal validation, Network Top3 accuracy reached 92.19% in leave-one-sample-out and 91.21% in leave-one-monkey-out evaluation across all 819 Network-evaluable samples, with lower accuracy at finer anatomical levels. External mapped-label and tumour/biofluid analyses define transfer limitations; cfRNA-BrainTrace is intended for reproducible coarse candidate ranking and resolution-limit auditing, not stand-alone clinical localization from unlabeled biofluid RNA.</w:t>
       </w:r>
     </w:p>
     <w:p>
@@ -349,7 +349,7 @@
     </w:p>
     <w:p>
       <w:r>
-        <w:t>The complete validation then tested the locked production route end to end: projected-VSD Network Top3 beam generation, logCPM-compatible resolution-group reranking and logCPM-compatible exact-region reranking. This route achieved Network Top3 accuracy of 92.38% in leave-one-sample-out validation and 91.21% in leave-one-monkey-out validation. Resolution-group Top3 accuracy was 72.36% and 69.09%, respectively, whereas exact-region Top3 was 45.33% and 42.36%. The accuracy gradient across levels supports Network Top3 as the primary endpoint and resolution group as the more defensible region-level output. Exact-region results are retained as exploratory local candidate rankings rather than a localization endpoint.</w:t>
+        <w:t>The complete validation then tested the three-tier architecture end to end: projected-VSD Network Top3 beam generation, logCPM-compatible resolution-group reranking and logCPM-compatible exact-region reranking. Network Top3 accuracy was 92.19% in leave-one-sample-out validation and 91.21% in leave-one-monkey-out validation, each evaluated across all 819 samples. Resolution-group Top3 accuracy was 72.36% among 814 LOSO reference-supported samples and 69.09% among 812 LOMO reference-supported samples, whereas exact-region Top3 was 45.33% and 42.36% on the same respective denominators. Five LOSO samples and seven LOMO samples lacked a truth-region reference after fold construction; they remained in Network evaluation but were not treated as region-level errors or successes. The accuracy gradient across levels supports Network Top3 as the primary endpoint and resolution group as the more defensible region-level output. Exact-region results are retained as exploratory local candidate rankings rather than a localization endpoint.</w:t>
       </w:r>
     </w:p>
     <w:p>
@@ -600,11 +600,9 @@
         <w:rPr>
           <w:b/>
         </w:rPr>
-        <w:t>Alt text:</w:t>
+        <w:t>Alt text: Multi-panel figure summarizing the cfRNA-BrainTrace workflow and validation. Panel A shows query preprocessing, projected-VSD Network Top3 beam generation and logCPM-compatible local reranking. Panel B shows internal LOSO and LOMO resolution gradients, AHBA mapped-label validation, and TCGA/BraTS coarse-consistency results: Network Top3 is 92.19% in LOSO and 91.21% in LOMO across all 819 samples; resolution-group Top3 is about 69%-72% and exact-region Top3 is about 42%-45% among reference-supported samples; AHBA Network Top3 is 94.42%; and TCGA/BraTS broad-anatomy Top3 is 64.62%. Biofluid stress-test results are not plotted as localization accuracy because anatomical truth is absent.</w:t>
       </w:r>
-      <w:r>
-        <w:t xml:space="preserve"> Multi-panel figure summarizing the cfRNA-BrainTrace workflow and validation. Panel A shows query preprocessing, projected-VSD Network Top3 beam generation and logCPM-compatible local reranking. Panel B shows internal LOSO and LOMO resolution gradients, AHBA mapped-label validation, and TCGA/BraTS coarse-consistency results: Network Top3 is near 92% internally, resolution-group Top3 is about 69%-72%, exact-region Top3 is about 42%-45%, AHBA Network Top3 is 94.42%, and TCGA/BraTS broad-anatomy Top3 is 64.62%. Biofluid stress-test results are not plotted as localization accuracy because anatomical truth is absent.</w:t>
-      </w:r>
+      <w:r/>
     </w:p>
     <w:p>
       <w:r>

</xml_diff>